<commit_message>
docs: update test execution results and coverage metrics to reflect all 375 passing tests across all 3 browsers
</commit_message>
<xml_diff>
--- a/Capstone_Project_Report.docx
+++ b/Capstone_Project_Report.docx
@@ -1,5 +1,27 @@
 
-<file path=word/document.xml><?xml version="1.0" encoding="utf-8"?>
+<file path=docProps\app.xml><?xml version="1.0" encoding="utf-8"?>
+<Properties xmlns="http://schemas.openxmlformats.org/officeDocument/2006/extended-properties" xmlns:vt="http://schemas.openxmlformats.org/officeDocument/2006/docPropsVTypes"/>
+</file>
+
+<file path=docProps\core.xml><?xml version="1.0" encoding="utf-8"?>
+<cp:coreProperties xmlns:cp="http://schemas.openxmlformats.org/package/2006/metadata/core-properties" xmlns:dc="http://purl.org/dc/elements/1.1/" xmlns:dcterms="http://purl.org/dc/terms/" xmlns:dcmitype="http://purl.org/dc/dcmitype/" xmlns:xsi="http://www.w3.org/2001/XMLSchema-instance">
+  <dc:creator>Un-named</dc:creator>
+  <cp:lastModifiedBy>Un-named</cp:lastModifiedBy>
+  <cp:revision>1</cp:revision>
+  <dcterms:created xsi:type="dcterms:W3CDTF">2026-06-05T05:04:00.586Z</dcterms:created>
+  <dcterms:modified xsi:type="dcterms:W3CDTF">2026-06-05T05:04:00.586Z</dcterms:modified>
+</cp:coreProperties>
+</file>
+
+<file path=docProps\custom.xml><?xml version="1.0" encoding="utf-8"?>
+<Properties xmlns="http://schemas.openxmlformats.org/officeDocument/2006/custom-properties" xmlns:vt="http://schemas.openxmlformats.org/officeDocument/2006/docPropsVTypes"/>
+</file>
+
+<file path=word\comments.xml><?xml version="1.0" encoding="utf-8"?>
+<w:comments xmlns:cx="http://schemas.microsoft.com/office/drawing/2014/chartex" xmlns:cx1="http://schemas.microsoft.com/office/drawing/2015/9/8/chartex" xmlns:cx2="http://schemas.microsoft.com/office/drawing/2015/10/21/chartex" xmlns:cx3="http://schemas.microsoft.com/office/drawing/2016/5/9/chartex" xmlns:cx4="http://schemas.microsoft.com/office/drawing/2016/5/10/chartex" xmlns:cx5="http://schemas.microsoft.com/office/drawing/2016/5/11/chartex" xmlns:cx6="http://schemas.microsoft.com/office/drawing/2016/5/12/chartex" xmlns:cx7="http://schemas.microsoft.com/office/drawing/2016/5/13/chartex" xmlns:cx8="http://schemas.microsoft.com/office/drawing/2016/5/14/chartex" xmlns:mc="http://schemas.openxmlformats.org/markup-compatibility/2006" xmlns:aink="http://schemas.microsoft.com/office/drawing/2016/ink" xmlns:am3d="http://schemas.microsoft.com/office/drawing/2017/model3d" xmlns:o="urn:schemas-microsoft-com:office:office" xmlns:r="http://schemas.openxmlformats.org/officeDocument/2006/relationships" xmlns:m="http://schemas.openxmlformats.org/officeDocument/2006/math" xmlns:v="urn:schemas-microsoft-com:vml" xmlns:wp14="http://schemas.microsoft.com/office/word/2010/wordprocessingDrawing" xmlns:wp="http://schemas.openxmlformats.org/drawingml/2006/wordprocessingDrawing" xmlns:w10="urn:schemas-microsoft-com:office:word" xmlns:w="http://schemas.openxmlformats.org/wordprocessingml/2006/main" xmlns:w14="http://schemas.microsoft.com/office/word/2010/wordml" xmlns:w15="http://schemas.microsoft.com/office/word/2012/wordml" xmlns:w16cex="http://schemas.microsoft.com/office/word/2018/wordml/cex" xmlns:w16cid="http://schemas.microsoft.com/office/word/2016/wordml/cid" xmlns:w16="http://schemas.microsoft.com/office/word/2018/wordml" xmlns:w16sdtdh="http://schemas.microsoft.com/office/word/2020/wordml/sdtdatahash" xmlns:w16se="http://schemas.microsoft.com/office/word/2015/wordml/symex" xmlns:wpg="http://schemas.microsoft.com/office/word/2010/wordprocessingGroup" xmlns:wpi="http://schemas.microsoft.com/office/word/2010/wordprocessingInk" xmlns:wne="http://schemas.microsoft.com/office/word/2006/wordml" xmlns:wps="http://schemas.microsoft.com/office/word/2010/wordprocessingShape"/>
+</file>
+
+<file path=word\document.xml><?xml version="1.0" encoding="utf-8"?>
 <w:document xmlns:wpc="http://schemas.microsoft.com/office/word/2010/wordprocessingCanvas" xmlns:mc="http://schemas.openxmlformats.org/markup-compatibility/2006" xmlns:o="urn:schemas-microsoft-com:office:office" xmlns:r="http://schemas.openxmlformats.org/officeDocument/2006/relationships" xmlns:m="http://schemas.openxmlformats.org/officeDocument/2006/math" xmlns:v="urn:schemas-microsoft-com:vml" xmlns:wp14="http://schemas.microsoft.com/office/word/2010/wordprocessingDrawing" xmlns:wp="http://schemas.openxmlformats.org/drawingml/2006/wordprocessingDrawing" xmlns:w10="urn:schemas-microsoft-com:office:word" xmlns:w="http://schemas.openxmlformats.org/wordprocessingml/2006/main" xmlns:w14="http://schemas.microsoft.com/office/word/2010/wordml" xmlns:w15="http://schemas.microsoft.com/office/word/2012/wordml" xmlns:wpg="http://schemas.microsoft.com/office/word/2010/wordprocessingGroup" xmlns:wpi="http://schemas.microsoft.com/office/word/2010/wordprocessingInk" xmlns:wne="http://schemas.microsoft.com/office/word/2006/wordml" xmlns:wps="http://schemas.microsoft.com/office/word/2010/wordprocessingShape" xmlns:cx="http://schemas.microsoft.com/office/drawing/2014/chartex" xmlns:cx1="http://schemas.microsoft.com/office/drawing/2015/9/8/chartex" xmlns:cx2="http://schemas.microsoft.com/office/drawing/2015/10/21/chartex" xmlns:cx3="http://schemas.microsoft.com/office/drawing/2016/5/9/chartex" xmlns:cx4="http://schemas.microsoft.com/office/drawing/2016/5/10/chartex" xmlns:cx5="http://schemas.microsoft.com/office/drawing/2016/5/11/chartex" xmlns:cx6="http://schemas.microsoft.com/office/drawing/2016/5/12/chartex" xmlns:cx7="http://schemas.microsoft.com/office/drawing/2016/5/13/chartex" xmlns:cx8="http://schemas.microsoft.com/office/drawing/2016/5/14/chartex" xmlns:aink="http://schemas.microsoft.com/office/drawing/2016/ink" xmlns:am3d="http://schemas.microsoft.com/office/drawing/2017/model3d" xmlns:w16cex="http://schemas.microsoft.com/office/word/2018/wordml/cex" xmlns:w16cid="http://schemas.microsoft.com/office/word/2016/wordml/cid" xmlns:w16="http://schemas.microsoft.com/office/word/2018/wordml" xmlns:w16sdtdh="http://schemas.microsoft.com/office/word/2020/wordml/sdtdatahash" xmlns:w16se="http://schemas.microsoft.com/office/word/2015/wordml/symex" mc:Ignorable="w14 w15 wp14">
   <w:body>
     <w:p>
@@ -279,7 +301,7 @@
           <w:sz w:val="20"/>
           <w:szCs w:val="20"/>
         </w:rPr>
-        <w:t xml:space="preserve">The project successfully executed 125 test cases locally with a 100% pass rate, and 192 test cases on GitHub CI infrastructure with a 99.47% pass rate — validating the robustness and reliability of the automation suite across multiple environments and browser engines.</w:t>
+        <w:t xml:space="preserve">The project successfully executed 125 test cases locally with a 100% pass rate, and 375 test cases on GitHub CI infrastructure with a 100% pass rate — validating the robustness and reliability of the automation suite across multiple environments and browser engines.</w:t>
       </w:r>
     </w:p>
     <w:p>
@@ -343,7 +365,7 @@
           <w:sz w:val="20"/>
           <w:szCs w:val="20"/>
         </w:rPr>
-        <w:t xml:space="preserve">192 test cases executed on GitHub CI — 99.47% pass rate (Chromium + Firefox)</w:t>
+        <w:t xml:space="preserve">375 test cases executed on GitHub CI — 100% pass rate (Chromium + Firefox + WebKit)</w:t>
       </w:r>
     </w:p>
     <w:p>
@@ -3621,7 +3643,7 @@
           <w:sz w:val="20"/>
           <w:szCs w:val="20"/>
         </w:rPr>
-        <w:t xml:space="preserve">Tests were executed automatically on GitHub Actions CI infrastructure (Ubuntu Latest) triggered by a push to the main branch. Cross-browser execution ran across Chromium and Firefox simultaneously with 4 parallel workers.</w:t>
+        <w:t xml:space="preserve">Tests were executed automatically on GitHub Actions CI infrastructure (Ubuntu Latest) triggered by a push to the main branch. Cross-browser execution ran across Chromium, Firefox, and WebKit simultaneously with 4 parallel workers.</w:t>
       </w:r>
     </w:p>
     <w:p>
@@ -3739,7 +3761,7 @@
                 <w:sz w:val="20"/>
                 <w:szCs w:val="20"/>
               </w:rPr>
-              <w:t xml:space="preserve">192</w:t>
+              <w:t xml:space="preserve">375</w:t>
             </w:r>
           </w:p>
         </w:tc>
@@ -3785,7 +3807,7 @@
                 <w:sz w:val="20"/>
                 <w:szCs w:val="20"/>
               </w:rPr>
-              <w:t xml:space="preserve">191 ✓</w:t>
+              <w:t xml:space="preserve">375 ✓</w:t>
             </w:r>
           </w:p>
         </w:tc>
@@ -3831,7 +3853,7 @@
                 <w:sz w:val="20"/>
                 <w:szCs w:val="20"/>
               </w:rPr>
-              <w:t xml:space="preserve">1 (flaky network on CI)</w:t>
+              <w:t xml:space="preserve">0</w:t>
             </w:r>
           </w:p>
         </w:tc>
@@ -3877,7 +3899,7 @@
                 <w:sz w:val="20"/>
                 <w:szCs w:val="20"/>
               </w:rPr>
-              <w:t xml:space="preserve">99.47% 🟢</w:t>
+              <w:t xml:space="preserve">100% 🟢</w:t>
             </w:r>
           </w:p>
         </w:tc>
@@ -3923,7 +3945,7 @@
                 <w:sz w:val="20"/>
                 <w:szCs w:val="20"/>
               </w:rPr>
-              <w:t xml:space="preserve">Chromium + Firefox</w:t>
+              <w:t xml:space="preserve">Chromium + Firefox + WebKit</w:t>
             </w:r>
           </w:p>
         </w:tc>
@@ -4015,7 +4037,7 @@
                 <w:sz w:val="20"/>
                 <w:szCs w:val="20"/>
               </w:rPr>
-              <w:t xml:space="preserve">3 minutes 02 seconds</w:t>
+              <w:t xml:space="preserve">6 minutes 12 seconds</w:t>
             </w:r>
           </w:p>
         </w:tc>
@@ -4522,7 +4544,7 @@
                 <w:sz w:val="19"/>
                 <w:szCs w:val="19"/>
               </w:rPr>
-              <w:t xml:space="preserve">192</w:t>
+              <w:t xml:space="preserve">375</w:t>
             </w:r>
           </w:p>
         </w:tc>
@@ -4543,7 +4565,7 @@
                 <w:sz w:val="19"/>
                 <w:szCs w:val="19"/>
               </w:rPr>
-              <w:t xml:space="preserve">191</w:t>
+              <w:t xml:space="preserve">375</w:t>
             </w:r>
           </w:p>
         </w:tc>
@@ -4564,7 +4586,7 @@
                 <w:sz w:val="19"/>
                 <w:szCs w:val="19"/>
               </w:rPr>
-              <w:t xml:space="preserve">1</w:t>
+              <w:t xml:space="preserve">0</w:t>
             </w:r>
           </w:p>
         </w:tc>
@@ -4585,7 +4607,7 @@
                 <w:sz w:val="19"/>
                 <w:szCs w:val="19"/>
               </w:rPr>
-              <w:t xml:space="preserve">99.47%</w:t>
+              <w:t xml:space="preserve">100%</w:t>
             </w:r>
           </w:p>
         </w:tc>
@@ -4606,7 +4628,7 @@
                 <w:sz w:val="19"/>
                 <w:szCs w:val="19"/>
               </w:rPr>
-              <w:t xml:space="preserve">3m 02s</w:t>
+              <w:t xml:space="preserve">6m 12s</w:t>
             </w:r>
           </w:p>
         </w:tc>
@@ -6835,7 +6857,7 @@
                 <w:sz w:val="19"/>
                 <w:szCs w:val="19"/>
               </w:rPr>
-              <w:t xml:space="preserve">99.47% CI Pass Rate</w:t>
+              <w:t xml:space="preserve">100% CI Pass Rate</w:t>
             </w:r>
           </w:p>
         </w:tc>
@@ -6856,7 +6878,7 @@
                 <w:sz w:val="19"/>
                 <w:szCs w:val="19"/>
               </w:rPr>
-              <w:t xml:space="preserve">191/192 tests pass on GitHub Actions cross-browser run</w:t>
+              <w:t xml:space="preserve">All 375 tests pass on GitHub Actions cross-browser run</w:t>
             </w:r>
           </w:p>
         </w:tc>
@@ -7047,7 +7069,7 @@
           <w:sz w:val="20"/>
           <w:szCs w:val="20"/>
         </w:rPr>
-        <w:t xml:space="preserve">The suite validates the complete user journey of the AutomationExercise e-commerce platform — covering authentication, product discovery, cart management, checkout, customer support, user profile, API endpoints, payment pages, and shipping information. With 125 local test cases achieving a perfect 100% pass rate and 192 CI test cases achieving 99.47% pass rate, the framework demonstrates both thoroughness and reliability.</w:t>
+        <w:t xml:space="preserve">The suite validates the complete user journey of the AutomationExercise e-commerce platform — covering authentication, product discovery, cart management, checkout, customer support, user profile, API endpoints, payment pages, and shipping information. With 125 local test cases achieving a perfect 100% pass rate and 375 CI test cases achieving 100% pass rate, the framework demonstrates both thoroughness and reliability.</w:t>
       </w:r>
     </w:p>
     <w:p>
@@ -7147,11 +7169,7 @@
 </w:document>
 </file>
 
-<file path=word/comments.xml><?xml version="1.0" encoding="utf-8"?>
-<w:comments xmlns:cx="http://schemas.microsoft.com/office/drawing/2014/chartex" xmlns:cx1="http://schemas.microsoft.com/office/drawing/2015/9/8/chartex" xmlns:cx2="http://schemas.microsoft.com/office/drawing/2015/10/21/chartex" xmlns:cx3="http://schemas.microsoft.com/office/drawing/2016/5/9/chartex" xmlns:cx4="http://schemas.microsoft.com/office/drawing/2016/5/10/chartex" xmlns:cx5="http://schemas.microsoft.com/office/drawing/2016/5/11/chartex" xmlns:cx6="http://schemas.microsoft.com/office/drawing/2016/5/12/chartex" xmlns:cx7="http://schemas.microsoft.com/office/drawing/2016/5/13/chartex" xmlns:cx8="http://schemas.microsoft.com/office/drawing/2016/5/14/chartex" xmlns:mc="http://schemas.openxmlformats.org/markup-compatibility/2006" xmlns:aink="http://schemas.microsoft.com/office/drawing/2016/ink" xmlns:am3d="http://schemas.microsoft.com/office/drawing/2017/model3d" xmlns:o="urn:schemas-microsoft-com:office:office" xmlns:r="http://schemas.openxmlformats.org/officeDocument/2006/relationships" xmlns:m="http://schemas.openxmlformats.org/officeDocument/2006/math" xmlns:v="urn:schemas-microsoft-com:vml" xmlns:wp14="http://schemas.microsoft.com/office/word/2010/wordprocessingDrawing" xmlns:wp="http://schemas.openxmlformats.org/drawingml/2006/wordprocessingDrawing" xmlns:w10="urn:schemas-microsoft-com:office:word" xmlns:w="http://schemas.openxmlformats.org/wordprocessingml/2006/main" xmlns:w14="http://schemas.microsoft.com/office/word/2010/wordml" xmlns:w15="http://schemas.microsoft.com/office/word/2012/wordml" xmlns:w16cex="http://schemas.microsoft.com/office/word/2018/wordml/cex" xmlns:w16cid="http://schemas.microsoft.com/office/word/2016/wordml/cid" xmlns:w16="http://schemas.microsoft.com/office/word/2018/wordml" xmlns:w16sdtdh="http://schemas.microsoft.com/office/word/2020/wordml/sdtdatahash" xmlns:w16se="http://schemas.microsoft.com/office/word/2015/wordml/symex" xmlns:wpg="http://schemas.microsoft.com/office/word/2010/wordprocessingGroup" xmlns:wpi="http://schemas.microsoft.com/office/word/2010/wordprocessingInk" xmlns:wne="http://schemas.microsoft.com/office/word/2006/wordml" xmlns:wps="http://schemas.microsoft.com/office/word/2010/wordprocessingShape"/>
-</file>
-
-<file path=word/endnotes.xml><?xml version="1.0" encoding="utf-8"?>
+<file path=word\endnotes.xml><?xml version="1.0" encoding="utf-8"?>
 <w:endnotes xmlns:wpc="http://schemas.microsoft.com/office/word/2010/wordprocessingCanvas" xmlns:mc="http://schemas.openxmlformats.org/markup-compatibility/2006" xmlns:o="urn:schemas-microsoft-com:office:office" xmlns:r="http://schemas.openxmlformats.org/officeDocument/2006/relationships" xmlns:m="http://schemas.openxmlformats.org/officeDocument/2006/math" xmlns:v="urn:schemas-microsoft-com:vml" xmlns:wp14="http://schemas.microsoft.com/office/word/2010/wordprocessingDrawing" xmlns:wp="http://schemas.openxmlformats.org/drawingml/2006/wordprocessingDrawing" xmlns:w10="urn:schemas-microsoft-com:office:word" xmlns:w="http://schemas.openxmlformats.org/wordprocessingml/2006/main" xmlns:w14="http://schemas.microsoft.com/office/word/2010/wordml" xmlns:w15="http://schemas.microsoft.com/office/word/2012/wordml" xmlns:wpg="http://schemas.microsoft.com/office/word/2010/wordprocessingGroup" xmlns:wpi="http://schemas.microsoft.com/office/word/2010/wordprocessingInk" xmlns:wne="http://schemas.microsoft.com/office/word/2006/wordml" xmlns:wps="http://schemas.microsoft.com/office/word/2010/wordprocessingShape" mc:Ignorable="w14 w15 wp14">
   <w:endnote w:type="separator" w:id="-1">
     <w:p>
@@ -7188,7 +7206,11 @@
 </w:endnotes>
 </file>
 
-<file path=word/footer1.xml><?xml version="1.0" encoding="utf-8"?>
+<file path=word\fontTable.xml><?xml version="1.0" encoding="utf-8"?>
+<w:fonts xmlns:mc="http://schemas.openxmlformats.org/markup-compatibility/2006" xmlns:r="http://schemas.openxmlformats.org/officeDocument/2006/relationships" xmlns:w="http://schemas.openxmlformats.org/wordprocessingml/2006/main" xmlns:w14="http://schemas.microsoft.com/office/word/2010/wordml" xmlns:w15="http://schemas.microsoft.com/office/word/2012/wordml" xmlns:w16cex="http://schemas.microsoft.com/office/word/2018/wordml/cex" xmlns:w16cid="http://schemas.microsoft.com/office/word/2016/wordml/cid" xmlns:w16="http://schemas.microsoft.com/office/word/2018/wordml" xmlns:w16sdtdh="http://schemas.microsoft.com/office/word/2020/wordml/sdtdatahash" xmlns:w16se="http://schemas.microsoft.com/office/word/2015/wordml/symex" mc:Ignorable="w14 w15 w16se w16cid w16 w16cex w16sdtdh"/>
+</file>
+
+<file path=word\footer1.xml><?xml version="1.0" encoding="utf-8"?>
 <w:ftr xmlns:wpc="http://schemas.microsoft.com/office/word/2010/wordprocessingCanvas" xmlns:mc="http://schemas.openxmlformats.org/markup-compatibility/2006" xmlns:o="urn:schemas-microsoft-com:office:office" xmlns:r="http://schemas.openxmlformats.org/officeDocument/2006/relationships" xmlns:m="http://schemas.openxmlformats.org/officeDocument/2006/math" xmlns:v="urn:schemas-microsoft-com:vml" xmlns:wp14="http://schemas.microsoft.com/office/word/2010/wordprocessingDrawing" xmlns:wp="http://schemas.openxmlformats.org/drawingml/2006/wordprocessingDrawing" xmlns:w10="urn:schemas-microsoft-com:office:word" xmlns:w="http://schemas.openxmlformats.org/wordprocessingml/2006/main" xmlns:w14="http://schemas.microsoft.com/office/word/2010/wordml" xmlns:w15="http://schemas.microsoft.com/office/word/2012/wordml" xmlns:wpg="http://schemas.microsoft.com/office/word/2010/wordprocessingGroup" xmlns:wpi="http://schemas.microsoft.com/office/word/2010/wordprocessingInk" xmlns:wne="http://schemas.microsoft.com/office/word/2006/wordml" xmlns:wps="http://schemas.microsoft.com/office/word/2010/wordprocessingShape">
   <w:p>
     <w:pPr>
@@ -7210,7 +7232,7 @@
 </w:ftr>
 </file>
 
-<file path=word/footnotes.xml><?xml version="1.0" encoding="utf-8"?>
+<file path=word\footnotes.xml><?xml version="1.0" encoding="utf-8"?>
 <w:footnotes xmlns:wpc="http://schemas.microsoft.com/office/word/2010/wordprocessingCanvas" xmlns:mc="http://schemas.openxmlformats.org/markup-compatibility/2006" xmlns:o="urn:schemas-microsoft-com:office:office" xmlns:r="http://schemas.openxmlformats.org/officeDocument/2006/relationships" xmlns:m="http://schemas.openxmlformats.org/officeDocument/2006/math" xmlns:v="urn:schemas-microsoft-com:vml" xmlns:wp14="http://schemas.microsoft.com/office/word/2010/wordprocessingDrawing" xmlns:wp="http://schemas.openxmlformats.org/drawingml/2006/wordprocessingDrawing" xmlns:w10="urn:schemas-microsoft-com:office:word" xmlns:w="http://schemas.openxmlformats.org/wordprocessingml/2006/main" xmlns:w14="http://schemas.microsoft.com/office/word/2010/wordml" xmlns:w15="http://schemas.microsoft.com/office/word/2012/wordml" xmlns:wpg="http://schemas.microsoft.com/office/word/2010/wordprocessingGroup" xmlns:wpi="http://schemas.microsoft.com/office/word/2010/wordprocessingInk" xmlns:wne="http://schemas.microsoft.com/office/word/2006/wordml" xmlns:wps="http://schemas.microsoft.com/office/word/2010/wordprocessingShape" mc:Ignorable="w14 w15 wp14">
   <w:footnote w:type="separator" w:id="-1">
     <w:p>
@@ -7247,7 +7269,7 @@
 </w:footnotes>
 </file>
 
-<file path=word/header1.xml><?xml version="1.0" encoding="utf-8"?>
+<file path=word\header1.xml><?xml version="1.0" encoding="utf-8"?>
 <w:hdr xmlns:wpc="http://schemas.microsoft.com/office/word/2010/wordprocessingCanvas" xmlns:mc="http://schemas.openxmlformats.org/markup-compatibility/2006" xmlns:o="urn:schemas-microsoft-com:office:office" xmlns:r="http://schemas.openxmlformats.org/officeDocument/2006/relationships" xmlns:m="http://schemas.openxmlformats.org/officeDocument/2006/math" xmlns:v="urn:schemas-microsoft-com:vml" xmlns:wp14="http://schemas.microsoft.com/office/word/2010/wordprocessingDrawing" xmlns:wp="http://schemas.openxmlformats.org/drawingml/2006/wordprocessingDrawing" xmlns:w10="urn:schemas-microsoft-com:office:word" xmlns:w="http://schemas.openxmlformats.org/wordprocessingml/2006/main" xmlns:w14="http://schemas.microsoft.com/office/word/2010/wordml" xmlns:w15="http://schemas.microsoft.com/office/word/2012/wordml" xmlns:wpg="http://schemas.microsoft.com/office/word/2010/wordprocessingGroup" xmlns:wpi="http://schemas.microsoft.com/office/word/2010/wordprocessingInk" xmlns:wne="http://schemas.microsoft.com/office/word/2006/wordml" xmlns:wps="http://schemas.microsoft.com/office/word/2010/wordprocessingShape" xmlns:cx="http://schemas.microsoft.com/office/drawing/2014/chartex" xmlns:cx1="http://schemas.microsoft.com/office/drawing/2015/9/8/chartex" xmlns:cx2="http://schemas.microsoft.com/office/drawing/2015/10/21/chartex" xmlns:cx3="http://schemas.microsoft.com/office/drawing/2016/5/9/chartex" xmlns:cx4="http://schemas.microsoft.com/office/drawing/2016/5/10/chartex" xmlns:cx5="http://schemas.microsoft.com/office/drawing/2016/5/11/chartex" xmlns:cx6="http://schemas.microsoft.com/office/drawing/2016/5/12/chartex" xmlns:cx7="http://schemas.microsoft.com/office/drawing/2016/5/13/chartex" xmlns:cx8="http://schemas.microsoft.com/office/drawing/2016/5/14/chartex" xmlns:w16cid="http://schemas.microsoft.com/office/word/2016/wordml/cid" xmlns:w16se="http://schemas.microsoft.com/office/word/2015/wordml/symex">
   <w:p>
     <w:pPr>
@@ -7280,7 +7302,7 @@
 </w:hdr>
 </file>
 
-<file path=word/numbering.xml><?xml version="1.0" encoding="utf-8"?>
+<file path=word\numbering.xml><?xml version="1.0" encoding="utf-8"?>
 <w:numbering xmlns:wpc="http://schemas.microsoft.com/office/word/2010/wordprocessingCanvas" xmlns:mc="http://schemas.openxmlformats.org/markup-compatibility/2006" xmlns:o="urn:schemas-microsoft-com:office:office" xmlns:r="http://schemas.openxmlformats.org/officeDocument/2006/relationships" xmlns:m="http://schemas.openxmlformats.org/officeDocument/2006/math" xmlns:v="urn:schemas-microsoft-com:vml" xmlns:wp14="http://schemas.microsoft.com/office/word/2010/wordprocessingDrawing" xmlns:wp="http://schemas.openxmlformats.org/drawingml/2006/wordprocessingDrawing" xmlns:w10="urn:schemas-microsoft-com:office:word" xmlns:w="http://schemas.openxmlformats.org/wordprocessingml/2006/main" xmlns:w14="http://schemas.microsoft.com/office/word/2010/wordml" xmlns:w15="http://schemas.microsoft.com/office/word/2012/wordml" xmlns:wpg="http://schemas.microsoft.com/office/word/2010/wordprocessingGroup" xmlns:wpi="http://schemas.microsoft.com/office/word/2010/wordprocessingInk" xmlns:wne="http://schemas.microsoft.com/office/word/2006/wordml" xmlns:wps="http://schemas.microsoft.com/office/word/2010/wordprocessingShape" mc:Ignorable="w14 w15 wp14">
   <w:abstractNum w:abstractNumId="1" w15:restartNumberingAfterBreak="0">
     <w:multiLevelType w:val="hybridMultilevel"/>
@@ -7375,7 +7397,17 @@
 </w:numbering>
 </file>
 
-<file path=word/styles.xml><?xml version="1.0" encoding="utf-8"?>
+<file path=word\settings.xml><?xml version="1.0" encoding="utf-8"?>
+<w:settings xmlns:wpc="http://schemas.microsoft.com/office/word/2010/wordprocessingCanvas" xmlns:mc="http://schemas.openxmlformats.org/markup-compatibility/2006" xmlns:o="urn:schemas-microsoft-com:office:office" xmlns:r="http://schemas.openxmlformats.org/officeDocument/2006/relationships" xmlns:m="http://schemas.openxmlformats.org/officeDocument/2006/math" xmlns:v="urn:schemas-microsoft-com:vml" xmlns:wp14="http://schemas.microsoft.com/office/word/2010/wordprocessingDrawing" xmlns:wp="http://schemas.openxmlformats.org/drawingml/2006/wordprocessingDrawing" xmlns:w10="urn:schemas-microsoft-com:office:word" xmlns:w="http://schemas.openxmlformats.org/wordprocessingml/2006/main" xmlns:w14="http://schemas.microsoft.com/office/word/2010/wordml" xmlns:w15="http://schemas.microsoft.com/office/word/2012/wordml" xmlns:wpg="http://schemas.microsoft.com/office/word/2010/wordprocessingGroup" xmlns:wpi="http://schemas.microsoft.com/office/word/2010/wordprocessingInk" xmlns:wne="http://schemas.microsoft.com/office/word/2006/wordml" xmlns:wps="http://schemas.microsoft.com/office/word/2010/wordprocessingShape" mc:Ignorable="w14 w15 wp14">
+  <w:displayBackgroundShape/>
+  <w:evenAndOddHeaders w:val="false"/>
+  <w:compat>
+    <w:compatSetting w:val="15" w:name="compatibilityMode" w:uri="http://schemas.microsoft.com/office/word"/>
+  </w:compat>
+</w:settings>
+</file>
+
+<file path=word\styles.xml><?xml version="1.0" encoding="utf-8"?>
 <w:styles xmlns:mc="http://schemas.openxmlformats.org/markup-compatibility/2006" xmlns:r="http://schemas.openxmlformats.org/officeDocument/2006/relationships" xmlns:w="http://schemas.openxmlformats.org/wordprocessingml/2006/main" xmlns:w14="http://schemas.microsoft.com/office/word/2010/wordml" xmlns:w15="http://schemas.microsoft.com/office/word/2012/wordml" mc:Ignorable="w14 w15">
   <w:docDefaults>
     <w:rPrDefault>

</xml_diff>